<commit_message>
fix(office): drop a Word table or row left empty by accepted deletions
Word refuses a table without rows, so accepting a deletion of every row now removes the table.

Co-Authored-By: Claude Opus 5.5 <noreply@anthropic.com>
Claude-Session: https://claude.ai/code/session_014z8zDTYjx4svG7mPVrGRtM
</commit_message>
<xml_diff>
--- a/tests/files/review.docx
+++ b/tests/files/review.docx
@@ -101,6 +101,27 @@
         </w:tc>
       </w:tr>
     </w:tbl>
+    <w:tbl>
+      <w:tblPr>
+        <w:tblW w:w="0" w:type="auto"/>
+      </w:tblPr>
+      <w:tblGrid>
+        <w:gridCol w:w="4000"/>
+      </w:tblGrid>
+      <w:tr>
+        <w:trPr>
+          <w:del w:id="20" w:author="Teodoro Rask" w:date="2026-05-02T10:00:00Z"/>
+        </w:trPr>
+        <w:tc>
+          <w:p>
+            <w:r>
+              <w:t>Whole table deleted</w:t>
+            </w:r>
+          </w:p>
+        </w:tc>
+      </w:tr>
+    </w:tbl>
+    <w:p/>
     <w:p>
       <w:r>
         <w:t>Closing line.</w:t>

</xml_diff>